<commit_message>
EV03: datos del aprendiz y enlace de GitHub
</commit_message>
<xml_diff>
--- a/Entregable/EV03_Entregable_Sintaxis_CSharp.docx
+++ b/Entregable/EV03_Entregable_Sintaxis_CSharp.docx
@@ -41,7 +41,7 @@
           <w:b w:val="0"/>
           <w:sz w:val="24"/>
         </w:rPr>
-        <w:t>Ficha: ______________________</w:t>
+        <w:t>Ficha: 3412768</w:t>
       </w:r>
     </w:p>
     <w:p/>
@@ -122,7 +122,7 @@
           <w:b w:val="0"/>
           <w:sz w:val="24"/>
         </w:rPr>
-        <w:t>Aprendiz: ______________________________________</w:t>
+        <w:t>Aprendiz: Sergio Osorio Zapata</w:t>
       </w:r>
     </w:p>
     <w:p>
@@ -4704,12 +4704,7 @@
           <w:color w:val="0563C1"/>
           <w:sz w:val="22"/>
         </w:rPr>
-        <w:t>https://github.com/[usuario]/Sintaxis_CSharp</w:t>
-      </w:r>
-    </w:p>
-    <w:p>
-      <w:r>
-        <w:t>Nota: reemplace [usuario] por el nombre de usuario de GitHub donde se aloje el repositorio.</w:t>
+        <w:t>https://github.com/sergioosoriozapata-source/-EV03</w:t>
       </w:r>
     </w:p>
     <w:sectPr>

</xml_diff>